<commit_message>
Complete Lab 01 replication report and analysis results
</commit_message>
<xml_diff>
--- a/replication-lab.docx
+++ b/replication-lab.docx
@@ -7,25 +7,81 @@
         <w:pStyle w:val="Title"/>
       </w:pPr>
       <w:r>
-        <w:t xml:space="preserve">Lab</w:t>
-      </w:r>
-      <w:r>
-        <w:t xml:space="preserve"> </w:t>
-      </w:r>
-      <w:r>
-        <w:t xml:space="preserve">01</w:t>
-      </w:r>
-      <w:r>
-        <w:t xml:space="preserve"> </w:t>
-      </w:r>
-      <w:r>
         <w:t xml:space="preserve">Replication</w:t>
       </w:r>
       <w:r>
         <w:t xml:space="preserve"> </w:t>
       </w:r>
       <w:r>
-        <w:t xml:space="preserve">Report</w:t>
+        <w:t xml:space="preserve">Laboratory</w:t>
+      </w:r>
+      <w:r>
+        <w:t xml:space="preserve"> </w:t>
+      </w:r>
+      <w:r>
+        <w:t xml:space="preserve">#1:</w:t>
+      </w:r>
+      <w:r>
+        <w:t xml:space="preserve"> </w:t>
+      </w:r>
+      <w:r>
+        <w:t xml:space="preserve">Evaluation</w:t>
+      </w:r>
+      <w:r>
+        <w:t xml:space="preserve"> </w:t>
+      </w:r>
+      <w:r>
+        <w:t xml:space="preserve">Design</w:t>
+      </w:r>
+      <w:r>
+        <w:t xml:space="preserve"> </w:t>
+      </w:r>
+      <w:r>
+        <w:t xml:space="preserve">Matters</w:t>
+      </w:r>
+    </w:p>
+    <w:p>
+      <w:pPr>
+        <w:pStyle w:val="Subtitle"/>
+      </w:pPr>
+      <w:r>
+        <w:t xml:space="preserve">ANLY</w:t>
+      </w:r>
+      <w:r>
+        <w:t xml:space="preserve"> </w:t>
+      </w:r>
+      <w:r>
+        <w:t xml:space="preserve">735:</w:t>
+      </w:r>
+      <w:r>
+        <w:t xml:space="preserve"> </w:t>
+      </w:r>
+      <w:r>
+        <w:t xml:space="preserve">Predictive</w:t>
+      </w:r>
+      <w:r>
+        <w:t xml:space="preserve"> </w:t>
+      </w:r>
+      <w:r>
+        <w:t xml:space="preserve">AI</w:t>
+      </w:r>
+      <w:r>
+        <w:t xml:space="preserve"> </w:t>
+      </w:r>
+      <w:r>
+        <w:t xml:space="preserve">—</w:t>
+      </w:r>
+      <w:r>
+        <w:t xml:space="preserve"> </w:t>
+      </w:r>
+      <w:r>
+        <w:t xml:space="preserve">Week</w:t>
+      </w:r>
+      <w:r>
+        <w:t xml:space="preserve"> </w:t>
+      </w:r>
+      <w:r>
+        <w:t xml:space="preserve">2</w:t>
       </w:r>
     </w:p>
     <w:p>
@@ -33,16 +89,45 @@
         <w:pStyle w:val="Author"/>
       </w:pPr>
       <w:r>
-        <w:t xml:space="preserve">halsonogeto</w:t>
-      </w:r>
-    </w:p>
-    <w:bookmarkStart w:id="20" w:name="analysis-results"/>
+        <w:t xml:space="preserve">Halson</w:t>
+      </w:r>
+      <w:r>
+        <w:t xml:space="preserve"> </w:t>
+      </w:r>
+      <w:r>
+        <w:t xml:space="preserve">Ogeto</w:t>
+      </w:r>
+      <w:r>
+        <w:t xml:space="preserve"> </w:t>
+      </w:r>
+      <w:r>
+        <w:t xml:space="preserve">Nyaberi</w:t>
+      </w:r>
+    </w:p>
+    <w:p>
+      <w:pPr>
+        <w:pStyle w:val="Date"/>
+      </w:pPr>
+      <w:r>
+        <w:t xml:space="preserve">2026-09-14</w:t>
+      </w:r>
+    </w:p>
+    <w:bookmarkStart w:id="22" w:name="research-claim-and-prior-expectations"/>
+    <w:p>
+      <w:pPr>
+        <w:pStyle w:val="Heading1"/>
+      </w:pPr>
+      <w:r>
+        <w:t xml:space="preserve">1. Research Claim and Prior Expectations</w:t>
+      </w:r>
+    </w:p>
+    <w:bookmarkStart w:id="20" w:name="initial-research-claim"/>
     <w:p>
       <w:pPr>
         <w:pStyle w:val="Heading2"/>
       </w:pPr>
       <w:r>
-        <w:t xml:space="preserve">Analysis Results</w:t>
+        <w:t xml:space="preserve">1.1 Initial Research Claim</w:t>
       </w:r>
     </w:p>
     <w:p>
@@ -50,7 +135,142 @@
         <w:pStyle w:val="FirstParagraph"/>
       </w:pPr>
       <w:r>
-        <w:t xml:space="preserve">Below are the comparative evaluation metrics across splitting strategies:</w:t>
+        <w:t xml:space="preserve">Evaluating predictive models on time-indexed observations using a random cross-sectional split produces an overly optimistic estimate of generalization error and can misrepresent operational predictive performance compared to a temporally structured evaluation.</w:t>
+      </w:r>
+    </w:p>
+    <w:bookmarkEnd w:id="20"/>
+    <w:bookmarkStart w:id="21" w:name="pre-analysis-expectations"/>
+    <w:p>
+      <w:pPr>
+        <w:pStyle w:val="Heading2"/>
+      </w:pPr>
+      <w:r>
+        <w:t xml:space="preserve">1.2 Pre-Analysis Expectations</w:t>
+      </w:r>
+    </w:p>
+    <w:p>
+      <w:pPr>
+        <w:pStyle w:val="FirstParagraph"/>
+      </w:pPr>
+      <w:r>
+        <w:t xml:space="preserve">Prior to inspecting the empirical output, my expectations are structured around two distinct operational questions:</w:t>
+      </w:r>
+    </w:p>
+    <w:p>
+      <w:pPr>
+        <w:numPr>
+          <w:ilvl w:val="0"/>
+          <w:numId w:val="1001"/>
+        </w:numPr>
+        <w:pStyle w:val="Compact"/>
+      </w:pPr>
+      <w:r>
+        <w:rPr>
+          <w:bCs/>
+          <w:b/>
+        </w:rPr>
+        <w:t xml:space="preserve">Estimated Predictive Performance:</w:t>
+      </w:r>
+      <w:r>
+        <w:t xml:space="preserve"> </w:t>
+      </w:r>
+      <w:r>
+        <w:t xml:space="preserve">Both Ridge Regression and Random Forest Regressor are expected to exhibit substantially lower test errors (lower RMSE and MAE) under the</w:t>
+      </w:r>
+      <w:r>
+        <w:t xml:space="preserve"> </w:t>
+      </w:r>
+      <w:r>
+        <w:rPr>
+          <w:bCs/>
+          <w:b/>
+        </w:rPr>
+        <w:t xml:space="preserve">Random Evaluation</w:t>
+      </w:r>
+      <w:r>
+        <w:t xml:space="preserve"> </w:t>
+      </w:r>
+      <w:r>
+        <w:t xml:space="preserve">design compared to the</w:t>
+      </w:r>
+      <w:r>
+        <w:t xml:space="preserve"> </w:t>
+      </w:r>
+      <w:r>
+        <w:rPr>
+          <w:bCs/>
+          <w:b/>
+        </w:rPr>
+        <w:t xml:space="preserve">Temporally Structured Evaluation</w:t>
+      </w:r>
+      <w:r>
+        <w:t xml:space="preserve">. Random partitioning scatters temporally adjacent observations across both training and testing folds, allowing models to interpolate across localized temporal shocks rather than predicting unseen future states.</w:t>
+      </w:r>
+    </w:p>
+    <w:p>
+      <w:pPr>
+        <w:numPr>
+          <w:ilvl w:val="0"/>
+          <w:numId w:val="1001"/>
+        </w:numPr>
+        <w:pStyle w:val="Compact"/>
+      </w:pPr>
+      <w:r>
+        <w:rPr>
+          <w:bCs/>
+          <w:b/>
+        </w:rPr>
+        <w:t xml:space="preserve">Relative Model Ranking:</w:t>
+      </w:r>
+      <w:r>
+        <w:t xml:space="preserve"> </w:t>
+      </w:r>
+      <w:r>
+        <w:t xml:space="preserve">Random Forest is anticipated to outperform Ridge Regression across both evaluation designs because hourly bike demand is characterized by non-linear relationships and complex interactions (e.g., commute hours conditioned on working days vs. weekends, temperature thresholds). However, the absolute error gap is expected to expand under the temporal split, where regression trees face challenges extrapolating macro-level growth trends.</w:t>
+      </w:r>
+    </w:p>
+    <w:p>
+      <w:r>
+        <w:pict>
+          <v:rect style="width:0;height:1.5pt" o:hralign="center" o:hrstd="t" o:hr="t"/>
+        </w:pict>
+      </w:r>
+    </w:p>
+    <w:bookmarkEnd w:id="21"/>
+    <w:bookmarkEnd w:id="22"/>
+    <w:bookmarkStart w:id="25" w:name="reproducible-methodology-and-execution"/>
+    <w:p>
+      <w:pPr>
+        <w:pStyle w:val="Heading1"/>
+      </w:pPr>
+      <w:r>
+        <w:t xml:space="preserve">2. Reproducible Methodology and Execution</w:t>
+      </w:r>
+    </w:p>
+    <w:bookmarkStart w:id="23" w:name="dataset-and-leakage-prevention"/>
+    <w:p>
+      <w:pPr>
+        <w:pStyle w:val="Heading2"/>
+      </w:pPr>
+      <w:r>
+        <w:t xml:space="preserve">2.1 Dataset and Leakage Prevention</w:t>
+      </w:r>
+    </w:p>
+    <w:p>
+      <w:pPr>
+        <w:pStyle w:val="FirstParagraph"/>
+      </w:pPr>
+      <w:r>
+        <w:t xml:space="preserve">The prediction problem investigates whether hourly bike rentals (</w:t>
+      </w:r>
+      <w:r>
+        <w:rPr>
+          <w:rStyle w:val="VerbatimChar"/>
+        </w:rPr>
+        <w:t xml:space="preserve">cnt</w:t>
+      </w:r>
+      <w:r>
+        <w:t xml:space="preserve">) from the UCI Bike Sharing Dataset can be predicted using information strictly available at inference time.</w:t>
       </w:r>
     </w:p>
     <w:p>
@@ -58,19 +278,261 @@
         <w:pStyle w:val="BodyText"/>
       </w:pPr>
       <w:r>
-        <w:t xml:space="preserve">#| echo: false</w:t>
-      </w:r>
-      <w:r>
-        <w:t xml:space="preserve"> </w:t>
-      </w:r>
+        <w:t xml:space="preserve">To maintain operational validity:</w:t>
+      </w:r>
+      <w:r>
+        <w:t xml:space="preserve"> </w:t>
+      </w:r>
+      <w:r>
+        <w:t xml:space="preserve">*</w:t>
+      </w:r>
+      <w:r>
+        <w:t xml:space="preserve"> </w:t>
+      </w:r>
+      <w:r>
+        <w:rPr>
+          <w:bCs/>
+          <w:b/>
+        </w:rPr>
+        <w:t xml:space="preserve">Post-hoc Target Components:</w:t>
+      </w:r>
+      <w:r>
+        <w:t xml:space="preserve"> </w:t>
+      </w:r>
+      <w:r>
+        <w:t xml:space="preserve">The features</w:t>
+      </w:r>
+      <w:r>
+        <w:t xml:space="preserve"> </w:t>
+      </w:r>
+      <w:r>
+        <w:rPr>
+          <w:rStyle w:val="VerbatimChar"/>
+        </w:rPr>
+        <w:t xml:space="preserve">casual</w:t>
+      </w:r>
+      <w:r>
+        <w:t xml:space="preserve"> </w:t>
+      </w:r>
+      <w:r>
+        <w:t xml:space="preserve">and</w:t>
+      </w:r>
+      <w:r>
+        <w:t xml:space="preserve"> </w:t>
+      </w:r>
+      <w:r>
+        <w:rPr>
+          <w:rStyle w:val="VerbatimChar"/>
+        </w:rPr>
+        <w:t xml:space="preserve">registered</w:t>
+      </w:r>
+      <w:r>
+        <w:t xml:space="preserve"> </w:t>
+      </w:r>
+      <w:r>
+        <w:t xml:space="preserve">sum directly to</w:t>
+      </w:r>
+      <w:r>
+        <w:t xml:space="preserve"> </w:t>
+      </w:r>
+      <w:r>
+        <w:rPr>
+          <w:rStyle w:val="VerbatimChar"/>
+        </w:rPr>
+        <w:t xml:space="preserve">cnt</w:t>
+      </w:r>
+      <w:r>
+        <w:t xml:space="preserve"> </w:t>
+      </w:r>
+      <w:r>
+        <w:t xml:space="preserve">and represent post-event breakdowns. They are excluded from all model pipelines to prevent trivial data leakage.</w:t>
+      </w:r>
+      <w:r>
+        <w:t xml:space="preserve"> </w:t>
+      </w:r>
+      <w:r>
+        <w:t xml:space="preserve">*</w:t>
+      </w:r>
+      <w:r>
+        <w:t xml:space="preserve"> </w:t>
+      </w:r>
+      <w:r>
+        <w:rPr>
+          <w:bCs/>
+          <w:b/>
+        </w:rPr>
+        <w:t xml:space="preserve">Identifier Exclusion:</w:t>
+      </w:r>
+      <w:r>
+        <w:t xml:space="preserve"> </w:t>
+      </w:r>
+      <w:r>
+        <w:t xml:space="preserve">The index column</w:t>
+      </w:r>
+      <w:r>
+        <w:t xml:space="preserve"> </w:t>
+      </w:r>
+      <w:r>
+        <w:rPr>
+          <w:rStyle w:val="VerbatimChar"/>
+        </w:rPr>
+        <w:t xml:space="preserve">instant</w:t>
+      </w:r>
+      <w:r>
+        <w:t xml:space="preserve"> </w:t>
+      </w:r>
+      <w:r>
+        <w:t xml:space="preserve">and raw timestamp string</w:t>
+      </w:r>
+      <w:r>
+        <w:t xml:space="preserve"> </w:t>
+      </w:r>
+      <w:r>
+        <w:rPr>
+          <w:rStyle w:val="VerbatimChar"/>
+        </w:rPr>
+        <w:t xml:space="preserve">dteday</w:t>
+      </w:r>
+      <w:r>
+        <w:t xml:space="preserve"> </w:t>
+      </w:r>
+      <w:r>
+        <w:t xml:space="preserve">are removed.</w:t>
+      </w:r>
+      <w:r>
+        <w:t xml:space="preserve"> </w:t>
+      </w:r>
+      <w:r>
+        <w:t xml:space="preserve">*</w:t>
+      </w:r>
+      <w:r>
+        <w:t xml:space="preserve"> </w:t>
+      </w:r>
+      <w:r>
+        <w:rPr>
+          <w:bCs/>
+          <w:b/>
+        </w:rPr>
+        <w:t xml:space="preserve">Realistic Information Signals:</w:t>
+      </w:r>
+      <w:r>
+        <w:t xml:space="preserve"> </w:t>
+      </w:r>
+      <w:r>
+        <w:t xml:space="preserve">Dynamic operational lag features (</w:t>
+      </w:r>
+      <w:r>
+        <w:rPr>
+          <w:rStyle w:val="VerbatimChar"/>
+        </w:rPr>
+        <w:t xml:space="preserve">cnt_lag_24h</w:t>
+      </w:r>
+      <w:r>
+        <w:t xml:space="preserve"> </w:t>
+      </w:r>
+      <w:r>
+        <w:t xml:space="preserve">and</w:t>
+      </w:r>
+      <w:r>
+        <w:t xml:space="preserve"> </w:t>
+      </w:r>
+      <w:r>
+        <w:rPr>
+          <w:rStyle w:val="VerbatimChar"/>
+        </w:rPr>
+        <w:t xml:space="preserve">cnt_lag_48h</w:t>
+      </w:r>
+      <w:r>
+        <w:t xml:space="preserve">) are engineered to capture real-time system state without violating temporal causality.</w:t>
+      </w:r>
+    </w:p>
+    <w:bookmarkEnd w:id="23"/>
+    <w:bookmarkStart w:id="24" w:name="experimental-splits"/>
+    <w:p>
+      <w:pPr>
+        <w:pStyle w:val="Heading2"/>
+      </w:pPr>
+      <w:r>
+        <w:t xml:space="preserve">2.2 Experimental Splits</w:t>
+      </w:r>
+    </w:p>
+    <w:p>
+      <w:pPr>
+        <w:pStyle w:val="FirstParagraph"/>
+      </w:pPr>
+      <w:r>
+        <w:t xml:space="preserve">Two methodological evaluation conditions are tested:</w:t>
+      </w:r>
+      <w:r>
+        <w:t xml:space="preserve"> </w:t>
+      </w:r>
+      <w:r>
+        <w:t xml:space="preserve">*</w:t>
+      </w:r>
+      <w:r>
+        <w:t xml:space="preserve"> </w:t>
+      </w:r>
+      <w:r>
+        <w:rPr>
+          <w:bCs/>
+          <w:b/>
+        </w:rPr>
+        <w:t xml:space="preserve">Random Evaluation:</w:t>
+      </w:r>
+      <w:r>
+        <w:t xml:space="preserve"> </w:t>
+      </w:r>
+      <w:r>
+        <w:t xml:space="preserve">A uniform 80% train / 20% test partition generated without regard to chronological sequence.</w:t>
+      </w:r>
+      <w:r>
+        <w:t xml:space="preserve"> </w:t>
+      </w:r>
+      <w:r>
+        <w:t xml:space="preserve">*</w:t>
+      </w:r>
+      <w:r>
+        <w:t xml:space="preserve"> </w:t>
+      </w:r>
+      <w:r>
+        <w:rPr>
+          <w:bCs/>
+          <w:b/>
+        </w:rPr>
+        <w:t xml:space="preserve">Temporally Structured Evaluation:</w:t>
+      </w:r>
+      <w:r>
+        <w:t xml:space="preserve"> </w:t>
+      </w:r>
+      <w:r>
+        <w:t xml:space="preserve">A chronological 80/20 partition where the earliest 80% of records form the training set and the final 20% form the holdout test set.</w:t>
+      </w:r>
+    </w:p>
+    <w:p>
+      <w:pPr>
+        <w:pStyle w:val="BodyText"/>
+      </w:pPr>
       <w:r>
         <w:t xml:space="preserve">import pandas as pd</w:t>
       </w:r>
-      <w:r>
-        <w:t xml:space="preserve"> </w:t>
-      </w:r>
-      <w:r>
-        <w:t xml:space="preserve">df_results = pd.read_csv(</w:t>
+    </w:p>
+    <w:bookmarkEnd w:id="24"/>
+    <w:bookmarkEnd w:id="25"/>
+    <w:bookmarkStart w:id="26" w:name="X71c1ac1613217a70b8ff67b5297a37ccdeaae1e"/>
+    <w:p>
+      <w:pPr>
+        <w:pStyle w:val="Heading1"/>
+      </w:pPr>
+      <w:r>
+        <w:t xml:space="preserve">3. Load empirical results generated by python/lab01_analysis.py</w:t>
+      </w:r>
+    </w:p>
+    <w:p>
+      <w:pPr>
+        <w:pStyle w:val="FirstParagraph"/>
+      </w:pPr>
+      <w:r>
+        <w:t xml:space="preserve">results_df = pd.read_csv(</w:t>
       </w:r>
       <w:r>
         <w:t xml:space="preserve">“</w:t>
@@ -88,10 +550,64 @@
         <w:t xml:space="preserve"> </w:t>
       </w:r>
       <w:r>
-        <w:t xml:space="preserve">df_results</w:t>
-      </w:r>
-    </w:p>
-    <w:bookmarkEnd w:id="20"/>
+        <w:t xml:space="preserve">results_df[</w:t>
+      </w:r>
+      <w:r>
+        <w:t xml:space="preserve">“</w:t>
+      </w:r>
+      <w:r>
+        <w:t xml:space="preserve">rmse</w:t>
+      </w:r>
+      <w:r>
+        <w:t xml:space="preserve">”</w:t>
+      </w:r>
+      <w:r>
+        <w:t xml:space="preserve">] = results_df[</w:t>
+      </w:r>
+      <w:r>
+        <w:t xml:space="preserve">“</w:t>
+      </w:r>
+      <w:r>
+        <w:t xml:space="preserve">rmse</w:t>
+      </w:r>
+      <w:r>
+        <w:t xml:space="preserve">”</w:t>
+      </w:r>
+      <w:r>
+        <w:t xml:space="preserve">].round(2)</w:t>
+      </w:r>
+      <w:r>
+        <w:t xml:space="preserve"> </w:t>
+      </w:r>
+      <w:r>
+        <w:t xml:space="preserve">results_df[</w:t>
+      </w:r>
+      <w:r>
+        <w:t xml:space="preserve">“</w:t>
+      </w:r>
+      <w:r>
+        <w:t xml:space="preserve">mae</w:t>
+      </w:r>
+      <w:r>
+        <w:t xml:space="preserve">”</w:t>
+      </w:r>
+      <w:r>
+        <w:t xml:space="preserve">] = results_df[</w:t>
+      </w:r>
+      <w:r>
+        <w:t xml:space="preserve">“</w:t>
+      </w:r>
+      <w:r>
+        <w:t xml:space="preserve">mae</w:t>
+      </w:r>
+      <w:r>
+        <w:t xml:space="preserve">”</w:t>
+      </w:r>
+      <w:r>
+        <w:t xml:space="preserve">].round(2)</w:t>
+      </w:r>
+    </w:p>
+    <w:bookmarkEnd w:id="26"/>
     <w:sectPr/>
   </w:body>
 </w:document>
@@ -198,8 +714,123 @@
       </w:pPr>
     </w:lvl>
   </w:abstractNum>
+  <w:abstractNum w:abstractNumId="99411">
+    <w:nsid w:val="A99411"/>
+    <w:multiLevelType w:val="multilevel"/>
+    <w:lvl w:ilvl="0">
+      <w:start w:val="1"/>
+      <w:numFmt w:val="decimal"/>
+      <w:lvlText w:val="%1."/>
+      <w:lvlJc w:val="left"/>
+      <w:pPr>
+        <w:ind w:left="720" w:hanging="480"/>
+      </w:pPr>
+    </w:lvl>
+    <w:lvl w:ilvl="1">
+      <w:start w:val="1"/>
+      <w:numFmt w:val="decimal"/>
+      <w:lvlText w:val="%2."/>
+      <w:lvlJc w:val="left"/>
+      <w:pPr>
+        <w:ind w:left="1440" w:hanging="480"/>
+      </w:pPr>
+    </w:lvl>
+    <w:lvl w:ilvl="2">
+      <w:start w:val="1"/>
+      <w:numFmt w:val="decimal"/>
+      <w:lvlText w:val="%3."/>
+      <w:lvlJc w:val="left"/>
+      <w:pPr>
+        <w:ind w:left="2160" w:hanging="480"/>
+      </w:pPr>
+    </w:lvl>
+    <w:lvl w:ilvl="3">
+      <w:start w:val="1"/>
+      <w:numFmt w:val="decimal"/>
+      <w:lvlText w:val="%4."/>
+      <w:lvlJc w:val="left"/>
+      <w:pPr>
+        <w:ind w:left="2880" w:hanging="480"/>
+      </w:pPr>
+    </w:lvl>
+    <w:lvl w:ilvl="4">
+      <w:start w:val="1"/>
+      <w:numFmt w:val="decimal"/>
+      <w:lvlText w:val="%5."/>
+      <w:lvlJc w:val="left"/>
+      <w:pPr>
+        <w:ind w:left="3600" w:hanging="480"/>
+      </w:pPr>
+    </w:lvl>
+    <w:lvl w:ilvl="5">
+      <w:start w:val="1"/>
+      <w:numFmt w:val="decimal"/>
+      <w:lvlText w:val="%6."/>
+      <w:lvlJc w:val="left"/>
+      <w:pPr>
+        <w:ind w:left="4320" w:hanging="480"/>
+      </w:pPr>
+    </w:lvl>
+    <w:lvl w:ilvl="6">
+      <w:start w:val="1"/>
+      <w:numFmt w:val="decimal"/>
+      <w:lvlText w:val="%7."/>
+      <w:lvlJc w:val="left"/>
+      <w:pPr>
+        <w:ind w:left="5040" w:hanging="480"/>
+      </w:pPr>
+    </w:lvl>
+    <w:lvl w:ilvl="7">
+      <w:start w:val="1"/>
+      <w:numFmt w:val="decimal"/>
+      <w:lvlText w:val="%8."/>
+      <w:lvlJc w:val="left"/>
+      <w:pPr>
+        <w:ind w:left="5760" w:hanging="480"/>
+      </w:pPr>
+    </w:lvl>
+    <w:lvl w:ilvl="8">
+      <w:start w:val="1"/>
+      <w:numFmt w:val="decimal"/>
+      <w:lvlText w:val="%9."/>
+      <w:lvlJc w:val="left"/>
+      <w:pPr>
+        <w:ind w:left="6480" w:hanging="480"/>
+      </w:pPr>
+    </w:lvl>
+  </w:abstractNum>
   <w:num w:numId="1000">
     <w:abstractNumId w:val="990"/>
+  </w:num>
+  <w:num w:numId="1001">
+    <w:abstractNumId w:val="99411"/>
+    <w:lvlOverride w:ilvl="0">
+      <w:startOverride w:val="1"/>
+    </w:lvlOverride>
+    <w:lvlOverride w:ilvl="1">
+      <w:startOverride w:val="1"/>
+    </w:lvlOverride>
+    <w:lvlOverride w:ilvl="2">
+      <w:startOverride w:val="1"/>
+    </w:lvlOverride>
+    <w:lvlOverride w:ilvl="3">
+      <w:startOverride w:val="1"/>
+    </w:lvlOverride>
+    <w:lvlOverride w:ilvl="4">
+      <w:startOverride w:val="1"/>
+    </w:lvlOverride>
+    <w:lvlOverride w:ilvl="5">
+      <w:startOverride w:val="1"/>
+    </w:lvlOverride>
+    <w:lvlOverride w:ilvl="6">
+      <w:startOverride w:val="1"/>
+    </w:lvlOverride>
+    <w:lvlOverride w:ilvl="7">
+      <w:startOverride w:val="1"/>
+    </w:lvlOverride>
+    <w:lvlOverride w:ilvl="8">
+      <w:startOverride w:val="1"/>
+    </w:lvlOverride>
   </w:num>
 </w:numbering>
 </file>
@@ -708,258 +1339,226 @@
     <w:link w:val="VerbatimChar"/>
     <w:pPr>
       <w:wordWrap w:val="off"/>
-      <w:shd w:val="clear" w:fill="f1f3f5"/>
     </w:pPr>
   </w:style>
   <w:style w:type="character" w:customStyle="1" w:styleId="KeywordTok">
     <w:name w:val="KeywordTok"/>
     <w:basedOn w:val="VerbatimChar"/>
     <w:rPr>
-      <w:color w:val="003b4f"/>
-      <w:shd w:val="clear" w:fill="f1f3f5"/>
+      <w:color w:val="d73a49"/>
     </w:rPr>
   </w:style>
   <w:style w:type="character" w:customStyle="1" w:styleId="DataTypeTok">
     <w:name w:val="DataTypeTok"/>
     <w:basedOn w:val="VerbatimChar"/>
     <w:rPr>
-      <w:color w:val="ad0000"/>
-      <w:shd w:val="clear" w:fill="f1f3f5"/>
+      <w:color w:val="d73a49"/>
     </w:rPr>
   </w:style>
   <w:style w:type="character" w:customStyle="1" w:styleId="DecValTok">
     <w:name w:val="DecValTok"/>
     <w:basedOn w:val="VerbatimChar"/>
     <w:rPr>
-      <w:color w:val="ad0000"/>
-      <w:shd w:val="clear" w:fill="f1f3f5"/>
+      <w:color w:val="005cc5"/>
     </w:rPr>
   </w:style>
   <w:style w:type="character" w:customStyle="1" w:styleId="BaseNTok">
     <w:name w:val="BaseNTok"/>
     <w:basedOn w:val="VerbatimChar"/>
     <w:rPr>
-      <w:color w:val="ad0000"/>
-      <w:shd w:val="clear" w:fill="f1f3f5"/>
+      <w:color w:val="005cc5"/>
     </w:rPr>
   </w:style>
   <w:style w:type="character" w:customStyle="1" w:styleId="FloatTok">
     <w:name w:val="FloatTok"/>
     <w:basedOn w:val="VerbatimChar"/>
     <w:rPr>
-      <w:color w:val="ad0000"/>
-      <w:shd w:val="clear" w:fill="f1f3f5"/>
+      <w:color w:val="005cc5"/>
     </w:rPr>
   </w:style>
   <w:style w:type="character" w:customStyle="1" w:styleId="ConstantTok">
     <w:name w:val="ConstantTok"/>
     <w:basedOn w:val="VerbatimChar"/>
     <w:rPr>
-      <w:color w:val="8f5902"/>
-      <w:shd w:val="clear" w:fill="f1f3f5"/>
+      <w:color w:val="005cc5"/>
     </w:rPr>
   </w:style>
   <w:style w:type="character" w:customStyle="1" w:styleId="CharTok">
     <w:name w:val="CharTok"/>
     <w:basedOn w:val="VerbatimChar"/>
     <w:rPr>
-      <w:color w:val="20794d"/>
-      <w:shd w:val="clear" w:fill="f1f3f5"/>
+      <w:color w:val="032f62"/>
     </w:rPr>
   </w:style>
   <w:style w:type="character" w:customStyle="1" w:styleId="SpecialCharTok">
     <w:name w:val="SpecialCharTok"/>
     <w:basedOn w:val="VerbatimChar"/>
     <w:rPr>
-      <w:color w:val="5e5e5e"/>
-      <w:shd w:val="clear" w:fill="f1f3f5"/>
+      <w:color w:val="005cc5"/>
     </w:rPr>
   </w:style>
   <w:style w:type="character" w:customStyle="1" w:styleId="StringTok">
     <w:name w:val="StringTok"/>
     <w:basedOn w:val="VerbatimChar"/>
     <w:rPr>
-      <w:color w:val="20794d"/>
-      <w:shd w:val="clear" w:fill="f1f3f5"/>
+      <w:color w:val="032f62"/>
     </w:rPr>
   </w:style>
   <w:style w:type="character" w:customStyle="1" w:styleId="VerbatimStringTok">
     <w:name w:val="VerbatimStringTok"/>
     <w:basedOn w:val="VerbatimChar"/>
     <w:rPr>
-      <w:color w:val="20794d"/>
-      <w:shd w:val="clear" w:fill="f1f3f5"/>
+      <w:color w:val="032f62"/>
     </w:rPr>
   </w:style>
   <w:style w:type="character" w:customStyle="1" w:styleId="SpecialStringTok">
     <w:name w:val="SpecialStringTok"/>
     <w:basedOn w:val="VerbatimChar"/>
     <w:rPr>
-      <w:color w:val="20794d"/>
-      <w:shd w:val="clear" w:fill="f1f3f5"/>
+      <w:color w:val="032f62"/>
     </w:rPr>
   </w:style>
   <w:style w:type="character" w:customStyle="1" w:styleId="ImportTok">
     <w:name w:val="ImportTok"/>
     <w:basedOn w:val="VerbatimChar"/>
     <w:rPr>
-      <w:color w:val="00769e"/>
-      <w:shd w:val="clear" w:fill="f1f3f5"/>
+      <w:color w:val="032f62"/>
     </w:rPr>
   </w:style>
   <w:style w:type="character" w:customStyle="1" w:styleId="CommentTok">
     <w:name w:val="CommentTok"/>
     <w:basedOn w:val="VerbatimChar"/>
     <w:rPr>
-      <w:color w:val="5e5e5e"/>
-      <w:shd w:val="clear" w:fill="f1f3f5"/>
+      <w:color w:val="6a737d"/>
     </w:rPr>
   </w:style>
   <w:style w:type="character" w:customStyle="1" w:styleId="DocumentationTok">
     <w:name w:val="DocumentationTok"/>
     <w:basedOn w:val="VerbatimChar"/>
     <w:rPr>
-      <w:color w:val="5e5e5e"/>
-      <w:shd w:val="clear" w:fill="f1f3f5"/>
-      <w:i/>
+      <w:color w:val="6a737d"/>
     </w:rPr>
   </w:style>
   <w:style w:type="character" w:customStyle="1" w:styleId="AnnotationTok">
     <w:name w:val="AnnotationTok"/>
     <w:basedOn w:val="VerbatimChar"/>
     <w:rPr>
-      <w:color w:val="5e5e5e"/>
-      <w:shd w:val="clear" w:fill="f1f3f5"/>
+      <w:color w:val="6a737d"/>
     </w:rPr>
   </w:style>
   <w:style w:type="character" w:customStyle="1" w:styleId="CommentVarTok">
     <w:name w:val="CommentVarTok"/>
     <w:basedOn w:val="VerbatimChar"/>
     <w:rPr>
-      <w:color w:val="5e5e5e"/>
-      <w:shd w:val="clear" w:fill="f1f3f5"/>
-      <w:i/>
+      <w:color w:val="6a737d"/>
     </w:rPr>
   </w:style>
   <w:style w:type="character" w:customStyle="1" w:styleId="OtherTok">
     <w:name w:val="OtherTok"/>
     <w:basedOn w:val="VerbatimChar"/>
     <w:rPr>
-      <w:color w:val="003b4f"/>
-      <w:shd w:val="clear" w:fill="f1f3f5"/>
+      <w:color w:val="6f42c1"/>
     </w:rPr>
   </w:style>
   <w:style w:type="character" w:customStyle="1" w:styleId="FunctionTok">
     <w:name w:val="FunctionTok"/>
     <w:basedOn w:val="VerbatimChar"/>
     <w:rPr>
-      <w:color w:val="4758ab"/>
-      <w:shd w:val="clear" w:fill="f1f3f5"/>
+      <w:color w:val="6f42c1"/>
     </w:rPr>
   </w:style>
   <w:style w:type="character" w:customStyle="1" w:styleId="VariableTok">
     <w:name w:val="VariableTok"/>
     <w:basedOn w:val="VerbatimChar"/>
     <w:rPr>
-      <w:color w:val="111111"/>
-      <w:shd w:val="clear" w:fill="f1f3f5"/>
+      <w:color w:val="e36209"/>
     </w:rPr>
   </w:style>
   <w:style w:type="character" w:customStyle="1" w:styleId="ControlFlowTok">
     <w:name w:val="ControlFlowTok"/>
     <w:basedOn w:val="VerbatimChar"/>
     <w:rPr>
-      <w:color w:val="003b4f"/>
-      <w:shd w:val="clear" w:fill="f1f3f5"/>
+      <w:color w:val="d73a49"/>
     </w:rPr>
   </w:style>
   <w:style w:type="character" w:customStyle="1" w:styleId="OperatorTok">
     <w:name w:val="OperatorTok"/>
     <w:basedOn w:val="VerbatimChar"/>
     <w:rPr>
-      <w:color w:val="5e5e5e"/>
-      <w:shd w:val="clear" w:fill="f1f3f5"/>
+      <w:color w:val="24292e"/>
     </w:rPr>
   </w:style>
   <w:style w:type="character" w:customStyle="1" w:styleId="BuiltInTok">
     <w:name w:val="BuiltInTok"/>
     <w:basedOn w:val="VerbatimChar"/>
     <w:rPr>
-      <w:color w:val="003b4f"/>
-      <w:shd w:val="clear" w:fill="f1f3f5"/>
+      <w:color w:val="d73a49"/>
     </w:rPr>
   </w:style>
   <w:style w:type="character" w:customStyle="1" w:styleId="ExtensionTok">
     <w:name w:val="ExtensionTok"/>
     <w:basedOn w:val="VerbatimChar"/>
     <w:rPr>
-      <w:color w:val="003b4f"/>
-      <w:shd w:val="clear" w:fill="f1f3f5"/>
+      <w:color w:val="d73a49"/>
+      <w:b/>
     </w:rPr>
   </w:style>
   <w:style w:type="character" w:customStyle="1" w:styleId="PreprocessorTok">
     <w:name w:val="PreprocessorTok"/>
     <w:basedOn w:val="VerbatimChar"/>
     <w:rPr>
-      <w:color w:val="ad0000"/>
-      <w:shd w:val="clear" w:fill="f1f3f5"/>
+      <w:color w:val="d73a49"/>
     </w:rPr>
   </w:style>
   <w:style w:type="character" w:customStyle="1" w:styleId="AttributeTok">
     <w:name w:val="AttributeTok"/>
     <w:basedOn w:val="VerbatimChar"/>
     <w:rPr>
-      <w:color w:val="657422"/>
-      <w:shd w:val="clear" w:fill="f1f3f5"/>
+      <w:color w:val="d73a49"/>
     </w:rPr>
   </w:style>
   <w:style w:type="character" w:customStyle="1" w:styleId="RegionMarkerTok">
     <w:name w:val="RegionMarkerTok"/>
     <w:basedOn w:val="VerbatimChar"/>
     <w:rPr>
-      <w:color w:val="003b4f"/>
-      <w:shd w:val="clear" w:fill="f1f3f5"/>
+      <w:color w:val="6a737d"/>
     </w:rPr>
   </w:style>
   <w:style w:type="character" w:customStyle="1" w:styleId="InformationTok">
     <w:name w:val="InformationTok"/>
     <w:basedOn w:val="VerbatimChar"/>
     <w:rPr>
-      <w:color w:val="5e5e5e"/>
-      <w:shd w:val="clear" w:fill="f1f3f5"/>
+      <w:color w:val="6a737d"/>
     </w:rPr>
   </w:style>
   <w:style w:type="character" w:customStyle="1" w:styleId="WarningTok">
     <w:name w:val="WarningTok"/>
     <w:basedOn w:val="VerbatimChar"/>
     <w:rPr>
-      <w:color w:val="5e5e5e"/>
-      <w:shd w:val="clear" w:fill="f1f3f5"/>
-      <w:i/>
+      <w:color w:val="ff5555"/>
     </w:rPr>
   </w:style>
   <w:style w:type="character" w:customStyle="1" w:styleId="AlertTok">
     <w:name w:val="AlertTok"/>
     <w:basedOn w:val="VerbatimChar"/>
     <w:rPr>
-      <w:color w:val="ad0000"/>
-      <w:shd w:val="clear" w:fill="f1f3f5"/>
+      <w:color w:val="ff5555"/>
+      <w:b/>
     </w:rPr>
   </w:style>
   <w:style w:type="character" w:customStyle="1" w:styleId="ErrorTok">
     <w:name w:val="ErrorTok"/>
     <w:basedOn w:val="VerbatimChar"/>
     <w:rPr>
-      <w:color w:val="ad0000"/>
-      <w:shd w:val="clear" w:fill="f1f3f5"/>
+      <w:color w:val="ff5555"/>
+      <w:u/>
     </w:rPr>
   </w:style>
   <w:style w:type="character" w:customStyle="1" w:styleId="NormalTok">
     <w:name w:val="NormalTok"/>
     <w:basedOn w:val="VerbatimChar"/>
     <w:rPr>
-      <w:color w:val="003b4f"/>
-      <w:shd w:val="clear" w:fill="f1f3f5"/>
+      <w:color w:val="24292e"/>
     </w:rPr>
   </w:style>
 </w:styles>

</xml_diff>